<commit_message>
UPDATED FILES FOR KMEANS
</commit_message>
<xml_diff>
--- a/LAMBDA/PCA_KMEANS/Lambda Setup Instructions.docx
+++ b/LAMBDA/PCA_KMEANS/Lambda Setup Instructions.docx
@@ -1313,12 +1313,8 @@
       <w:r>
         <w:rPr>
           <w:b/>
-          <w:bCs/>
-        </w:rPr>
-        <w:t xml:space="preserve">IMPORTANT: </w:t>
-      </w:r>
-      <w:r>
-        <w:t xml:space="preserve">After pasting FEATURE_NAMES, you must also update the USER_FEATURE_MAP dictionary. The INSTRUCTION comment in the code tells you exactly what to run in your notebook to find the correct index values.</w:t>
+        </w:rPr>
+        <w:t>Note: After you populate FEATURE_NAMES, the Lambda function automatically computes USER_FEATURE_MAP at startup. You do not need to manually update USER_FEATURE_MAP — just make sure FEATURE_NAMES is correct and the 5 user feature names (Overall Qual, Gr Liv Area, Year Built, Total Bsmt SF, Garage Area) appear in your list.</w:t>
       </w:r>
     </w:p>
     <w:p>

</xml_diff>